<commit_message>
docs(bao_cao): rebuild report and slides with new dashboard screenshots
- Screenshots retaken on the redesigned UI.
- Decision-tree paragraph (6.6) and feature count read from artifacts.
- OLAP and alerts-page descriptions match the new UI; page list updated.
- AI-use declaration and progress log cover the 2026-10-28 session.

Co-Authored-By: Claude Opus 5.5 <noreply@anthropic.com>
</commit_message>
<xml_diff>
--- a/bao_cao/BaoCao_BTL_INT1422.docx
+++ b/bao_cao/BaoCao_BTL_INT1422.docx
@@ -438,7 +438,7 @@
       <w:r>
         <w:fldChar w:fldCharType="separate"/>
       </w:r>
-      <w:hyperlink w:anchor="_Toc242713002" w:history="1">
+      <w:hyperlink w:anchor="_Toc244100449" w:history="1">
         <w:r>
           <w:rPr>
             <w:rStyle w:val="Hyperlink"/>
@@ -466,7 +466,7 @@
             <w:noProof/>
             <w:webHidden/>
           </w:rPr>
-          <w:instrText xml:space="preserve"> PAGEREF _Toc242713002 \h </w:instrText>
+          <w:instrText xml:space="preserve"> PAGEREF _Toc244100449 \h </w:instrText>
         </w:r>
         <w:r>
           <w:rPr>
@@ -507,7 +507,7 @@
           <w:noProof/>
         </w:rPr>
       </w:pPr>
-      <w:hyperlink w:anchor="_Toc242713003" w:history="1">
+      <w:hyperlink w:anchor="_Toc244100450" w:history="1">
         <w:r>
           <w:rPr>
             <w:rStyle w:val="Hyperlink"/>
@@ -535,7 +535,7 @@
             <w:noProof/>
             <w:webHidden/>
           </w:rPr>
-          <w:instrText xml:space="preserve"> PAGEREF _Toc242713003 \h </w:instrText>
+          <w:instrText xml:space="preserve"> PAGEREF _Toc244100450 \h </w:instrText>
         </w:r>
         <w:r>
           <w:rPr>
@@ -576,7 +576,7 @@
           <w:noProof/>
         </w:rPr>
       </w:pPr>
-      <w:hyperlink w:anchor="_Toc242713004" w:history="1">
+      <w:hyperlink w:anchor="_Toc244100451" w:history="1">
         <w:r>
           <w:rPr>
             <w:rStyle w:val="Hyperlink"/>
@@ -604,7 +604,7 @@
             <w:noProof/>
             <w:webHidden/>
           </w:rPr>
-          <w:instrText xml:space="preserve"> PAGEREF _Toc242713004 \h </w:instrText>
+          <w:instrText xml:space="preserve"> PAGEREF _Toc244100451 \h </w:instrText>
         </w:r>
         <w:r>
           <w:rPr>
@@ -645,7 +645,7 @@
           <w:noProof/>
         </w:rPr>
       </w:pPr>
-      <w:hyperlink w:anchor="_Toc242713005" w:history="1">
+      <w:hyperlink w:anchor="_Toc244100452" w:history="1">
         <w:r>
           <w:rPr>
             <w:rStyle w:val="Hyperlink"/>
@@ -673,7 +673,7 @@
             <w:noProof/>
             <w:webHidden/>
           </w:rPr>
-          <w:instrText xml:space="preserve"> PAGEREF _Toc242713005 \h </w:instrText>
+          <w:instrText xml:space="preserve"> PAGEREF _Toc244100452 \h </w:instrText>
         </w:r>
         <w:r>
           <w:rPr>
@@ -714,7 +714,7 @@
           <w:noProof/>
         </w:rPr>
       </w:pPr>
-      <w:hyperlink w:anchor="_Toc242713006" w:history="1">
+      <w:hyperlink w:anchor="_Toc244100453" w:history="1">
         <w:r>
           <w:rPr>
             <w:rStyle w:val="Hyperlink"/>
@@ -742,7 +742,7 @@
             <w:noProof/>
             <w:webHidden/>
           </w:rPr>
-          <w:instrText xml:space="preserve"> PAGEREF _Toc242713006 \h </w:instrText>
+          <w:instrText xml:space="preserve"> PAGEREF _Toc244100453 \h </w:instrText>
         </w:r>
         <w:r>
           <w:rPr>
@@ -783,7 +783,7 @@
           <w:noProof/>
         </w:rPr>
       </w:pPr>
-      <w:hyperlink w:anchor="_Toc242713007" w:history="1">
+      <w:hyperlink w:anchor="_Toc244100454" w:history="1">
         <w:r>
           <w:rPr>
             <w:rStyle w:val="Hyperlink"/>
@@ -811,7 +811,7 @@
             <w:noProof/>
             <w:webHidden/>
           </w:rPr>
-          <w:instrText xml:space="preserve"> PAGEREF _Toc242713007 \h </w:instrText>
+          <w:instrText xml:space="preserve"> PAGEREF _Toc244100454 \h </w:instrText>
         </w:r>
         <w:r>
           <w:rPr>
@@ -852,7 +852,7 @@
           <w:noProof/>
         </w:rPr>
       </w:pPr>
-      <w:hyperlink w:anchor="_Toc242713008" w:history="1">
+      <w:hyperlink w:anchor="_Toc244100455" w:history="1">
         <w:r>
           <w:rPr>
             <w:rStyle w:val="Hyperlink"/>
@@ -880,7 +880,7 @@
             <w:noProof/>
             <w:webHidden/>
           </w:rPr>
-          <w:instrText xml:space="preserve"> PAGEREF _Toc242713008 \h </w:instrText>
+          <w:instrText xml:space="preserve"> PAGEREF _Toc244100455 \h </w:instrText>
         </w:r>
         <w:r>
           <w:rPr>
@@ -921,7 +921,7 @@
           <w:noProof/>
         </w:rPr>
       </w:pPr>
-      <w:hyperlink w:anchor="_Toc242713009" w:history="1">
+      <w:hyperlink w:anchor="_Toc244100456" w:history="1">
         <w:r>
           <w:rPr>
             <w:rStyle w:val="Hyperlink"/>
@@ -949,7 +949,7 @@
             <w:noProof/>
             <w:webHidden/>
           </w:rPr>
-          <w:instrText xml:space="preserve"> PAGEREF _Toc242713009 \h </w:instrText>
+          <w:instrText xml:space="preserve"> PAGEREF _Toc244100456 \h </w:instrText>
         </w:r>
         <w:r>
           <w:rPr>
@@ -990,7 +990,7 @@
           <w:noProof/>
         </w:rPr>
       </w:pPr>
-      <w:hyperlink w:anchor="_Toc242713010" w:history="1">
+      <w:hyperlink w:anchor="_Toc244100457" w:history="1">
         <w:r>
           <w:rPr>
             <w:rStyle w:val="Hyperlink"/>
@@ -1018,7 +1018,7 @@
             <w:noProof/>
             <w:webHidden/>
           </w:rPr>
-          <w:instrText xml:space="preserve"> PAGEREF _Toc242713010 \h </w:instrText>
+          <w:instrText xml:space="preserve"> PAGEREF _Toc244100457 \h </w:instrText>
         </w:r>
         <w:r>
           <w:rPr>
@@ -1059,7 +1059,7 @@
           <w:noProof/>
         </w:rPr>
       </w:pPr>
-      <w:hyperlink w:anchor="_Toc242713011" w:history="1">
+      <w:hyperlink w:anchor="_Toc244100458" w:history="1">
         <w:r>
           <w:rPr>
             <w:rStyle w:val="Hyperlink"/>
@@ -1087,7 +1087,7 @@
             <w:noProof/>
             <w:webHidden/>
           </w:rPr>
-          <w:instrText xml:space="preserve"> PAGEREF _Toc242713011 \h </w:instrText>
+          <w:instrText xml:space="preserve"> PAGEREF _Toc244100458 \h </w:instrText>
         </w:r>
         <w:r>
           <w:rPr>
@@ -1128,7 +1128,7 @@
           <w:noProof/>
         </w:rPr>
       </w:pPr>
-      <w:hyperlink w:anchor="_Toc242713012" w:history="1">
+      <w:hyperlink w:anchor="_Toc244100459" w:history="1">
         <w:r>
           <w:rPr>
             <w:rStyle w:val="Hyperlink"/>
@@ -1156,7 +1156,7 @@
             <w:noProof/>
             <w:webHidden/>
           </w:rPr>
-          <w:instrText xml:space="preserve"> PAGEREF _Toc242713012 \h </w:instrText>
+          <w:instrText xml:space="preserve"> PAGEREF _Toc244100459 \h </w:instrText>
         </w:r>
         <w:r>
           <w:rPr>
@@ -1197,7 +1197,7 @@
           <w:noProof/>
         </w:rPr>
       </w:pPr>
-      <w:hyperlink w:anchor="_Toc242713013" w:history="1">
+      <w:hyperlink w:anchor="_Toc244100460" w:history="1">
         <w:r>
           <w:rPr>
             <w:rStyle w:val="Hyperlink"/>
@@ -1225,7 +1225,7 @@
             <w:noProof/>
             <w:webHidden/>
           </w:rPr>
-          <w:instrText xml:space="preserve"> PAGEREF _Toc242713013 \h </w:instrText>
+          <w:instrText xml:space="preserve"> PAGEREF _Toc244100460 \h </w:instrText>
         </w:r>
         <w:r>
           <w:rPr>
@@ -1266,7 +1266,7 @@
           <w:noProof/>
         </w:rPr>
       </w:pPr>
-      <w:hyperlink w:anchor="_Toc242713014" w:history="1">
+      <w:hyperlink w:anchor="_Toc244100461" w:history="1">
         <w:r>
           <w:rPr>
             <w:rStyle w:val="Hyperlink"/>
@@ -1294,7 +1294,7 @@
             <w:noProof/>
             <w:webHidden/>
           </w:rPr>
-          <w:instrText xml:space="preserve"> PAGEREF _Toc242713014 \h </w:instrText>
+          <w:instrText xml:space="preserve"> PAGEREF _Toc244100461 \h </w:instrText>
         </w:r>
         <w:r>
           <w:rPr>
@@ -1335,7 +1335,7 @@
           <w:noProof/>
         </w:rPr>
       </w:pPr>
-      <w:hyperlink w:anchor="_Toc242713015" w:history="1">
+      <w:hyperlink w:anchor="_Toc244100462" w:history="1">
         <w:r>
           <w:rPr>
             <w:rStyle w:val="Hyperlink"/>
@@ -1363,7 +1363,7 @@
             <w:noProof/>
             <w:webHidden/>
           </w:rPr>
-          <w:instrText xml:space="preserve"> PAGEREF _Toc242713015 \h </w:instrText>
+          <w:instrText xml:space="preserve"> PAGEREF _Toc244100462 \h </w:instrText>
         </w:r>
         <w:r>
           <w:rPr>
@@ -1404,7 +1404,7 @@
           <w:noProof/>
         </w:rPr>
       </w:pPr>
-      <w:hyperlink w:anchor="_Toc242713016" w:history="1">
+      <w:hyperlink w:anchor="_Toc244100463" w:history="1">
         <w:r>
           <w:rPr>
             <w:rStyle w:val="Hyperlink"/>
@@ -1432,7 +1432,7 @@
             <w:noProof/>
             <w:webHidden/>
           </w:rPr>
-          <w:instrText xml:space="preserve"> PAGEREF _Toc242713016 \h </w:instrText>
+          <w:instrText xml:space="preserve"> PAGEREF _Toc244100463 \h </w:instrText>
         </w:r>
         <w:r>
           <w:rPr>
@@ -1473,7 +1473,7 @@
           <w:noProof/>
         </w:rPr>
       </w:pPr>
-      <w:hyperlink w:anchor="_Toc242713017" w:history="1">
+      <w:hyperlink w:anchor="_Toc244100464" w:history="1">
         <w:r>
           <w:rPr>
             <w:rStyle w:val="Hyperlink"/>
@@ -1501,7 +1501,7 @@
             <w:noProof/>
             <w:webHidden/>
           </w:rPr>
-          <w:instrText xml:space="preserve"> PAGEREF _Toc242713017 \h </w:instrText>
+          <w:instrText xml:space="preserve"> PAGEREF _Toc244100464 \h </w:instrText>
         </w:r>
         <w:r>
           <w:rPr>
@@ -1542,7 +1542,7 @@
           <w:noProof/>
         </w:rPr>
       </w:pPr>
-      <w:hyperlink w:anchor="_Toc242713018" w:history="1">
+      <w:hyperlink w:anchor="_Toc244100465" w:history="1">
         <w:r>
           <w:rPr>
             <w:rStyle w:val="Hyperlink"/>
@@ -1570,7 +1570,7 @@
             <w:noProof/>
             <w:webHidden/>
           </w:rPr>
-          <w:instrText xml:space="preserve"> PAGEREF _Toc242713018 \h </w:instrText>
+          <w:instrText xml:space="preserve"> PAGEREF _Toc244100465 \h </w:instrText>
         </w:r>
         <w:r>
           <w:rPr>
@@ -1611,7 +1611,7 @@
           <w:noProof/>
         </w:rPr>
       </w:pPr>
-      <w:hyperlink w:anchor="_Toc242713019" w:history="1">
+      <w:hyperlink w:anchor="_Toc244100466" w:history="1">
         <w:r>
           <w:rPr>
             <w:rStyle w:val="Hyperlink"/>
@@ -1639,7 +1639,7 @@
             <w:noProof/>
             <w:webHidden/>
           </w:rPr>
-          <w:instrText xml:space="preserve"> PAGEREF _Toc242713019 \h </w:instrText>
+          <w:instrText xml:space="preserve"> PAGEREF _Toc244100466 \h </w:instrText>
         </w:r>
         <w:r>
           <w:rPr>
@@ -1680,7 +1680,7 @@
           <w:noProof/>
         </w:rPr>
       </w:pPr>
-      <w:hyperlink w:anchor="_Toc242713020" w:history="1">
+      <w:hyperlink w:anchor="_Toc244100467" w:history="1">
         <w:r>
           <w:rPr>
             <w:rStyle w:val="Hyperlink"/>
@@ -1708,7 +1708,7 @@
             <w:noProof/>
             <w:webHidden/>
           </w:rPr>
-          <w:instrText xml:space="preserve"> PAGEREF _Toc242713020 \h </w:instrText>
+          <w:instrText xml:space="preserve"> PAGEREF _Toc244100467 \h </w:instrText>
         </w:r>
         <w:r>
           <w:rPr>
@@ -1749,7 +1749,7 @@
           <w:noProof/>
         </w:rPr>
       </w:pPr>
-      <w:hyperlink w:anchor="_Toc242713021" w:history="1">
+      <w:hyperlink w:anchor="_Toc244100468" w:history="1">
         <w:r>
           <w:rPr>
             <w:rStyle w:val="Hyperlink"/>
@@ -1777,7 +1777,7 @@
             <w:noProof/>
             <w:webHidden/>
           </w:rPr>
-          <w:instrText xml:space="preserve"> PAGEREF _Toc242713021 \h </w:instrText>
+          <w:instrText xml:space="preserve"> PAGEREF _Toc244100468 \h </w:instrText>
         </w:r>
         <w:r>
           <w:rPr>
@@ -1818,7 +1818,7 @@
           <w:noProof/>
         </w:rPr>
       </w:pPr>
-      <w:hyperlink w:anchor="_Toc242713022" w:history="1">
+      <w:hyperlink w:anchor="_Toc244100469" w:history="1">
         <w:r>
           <w:rPr>
             <w:rStyle w:val="Hyperlink"/>
@@ -1846,7 +1846,7 @@
             <w:noProof/>
             <w:webHidden/>
           </w:rPr>
-          <w:instrText xml:space="preserve"> PAGEREF _Toc242713022 \h </w:instrText>
+          <w:instrText xml:space="preserve"> PAGEREF _Toc244100469 \h </w:instrText>
         </w:r>
         <w:r>
           <w:rPr>
@@ -1887,7 +1887,7 @@
           <w:noProof/>
         </w:rPr>
       </w:pPr>
-      <w:hyperlink w:anchor="_Toc242713023" w:history="1">
+      <w:hyperlink w:anchor="_Toc244100470" w:history="1">
         <w:r>
           <w:rPr>
             <w:rStyle w:val="Hyperlink"/>
@@ -1915,7 +1915,7 @@
             <w:noProof/>
             <w:webHidden/>
           </w:rPr>
-          <w:instrText xml:space="preserve"> PAGEREF _Toc242713023 \h </w:instrText>
+          <w:instrText xml:space="preserve"> PAGEREF _Toc244100470 \h </w:instrText>
         </w:r>
         <w:r>
           <w:rPr>
@@ -1956,7 +1956,7 @@
           <w:noProof/>
         </w:rPr>
       </w:pPr>
-      <w:hyperlink w:anchor="_Toc242713024" w:history="1">
+      <w:hyperlink w:anchor="_Toc244100471" w:history="1">
         <w:r>
           <w:rPr>
             <w:rStyle w:val="Hyperlink"/>
@@ -1984,7 +1984,7 @@
             <w:noProof/>
             <w:webHidden/>
           </w:rPr>
-          <w:instrText xml:space="preserve"> PAGEREF _Toc242713024 \h </w:instrText>
+          <w:instrText xml:space="preserve"> PAGEREF _Toc244100471 \h </w:instrText>
         </w:r>
         <w:r>
           <w:rPr>
@@ -2025,7 +2025,7 @@
           <w:noProof/>
         </w:rPr>
       </w:pPr>
-      <w:hyperlink w:anchor="_Toc242713025" w:history="1">
+      <w:hyperlink w:anchor="_Toc244100472" w:history="1">
         <w:r>
           <w:rPr>
             <w:rStyle w:val="Hyperlink"/>
@@ -2053,7 +2053,7 @@
             <w:noProof/>
             <w:webHidden/>
           </w:rPr>
-          <w:instrText xml:space="preserve"> PAGEREF _Toc242713025 \h </w:instrText>
+          <w:instrText xml:space="preserve"> PAGEREF _Toc244100472 \h </w:instrText>
         </w:r>
         <w:r>
           <w:rPr>
@@ -2094,7 +2094,7 @@
           <w:noProof/>
         </w:rPr>
       </w:pPr>
-      <w:hyperlink w:anchor="_Toc242713026" w:history="1">
+      <w:hyperlink w:anchor="_Toc244100473" w:history="1">
         <w:r>
           <w:rPr>
             <w:rStyle w:val="Hyperlink"/>
@@ -2122,7 +2122,7 @@
             <w:noProof/>
             <w:webHidden/>
           </w:rPr>
-          <w:instrText xml:space="preserve"> PAGEREF _Toc242713026 \h </w:instrText>
+          <w:instrText xml:space="preserve"> PAGEREF _Toc244100473 \h </w:instrText>
         </w:r>
         <w:r>
           <w:rPr>
@@ -2163,7 +2163,7 @@
           <w:noProof/>
         </w:rPr>
       </w:pPr>
-      <w:hyperlink w:anchor="_Toc242713027" w:history="1">
+      <w:hyperlink w:anchor="_Toc244100474" w:history="1">
         <w:r>
           <w:rPr>
             <w:rStyle w:val="Hyperlink"/>
@@ -2191,7 +2191,7 @@
             <w:noProof/>
             <w:webHidden/>
           </w:rPr>
-          <w:instrText xml:space="preserve"> PAGEREF _Toc242713027 \h </w:instrText>
+          <w:instrText xml:space="preserve"> PAGEREF _Toc244100474 \h </w:instrText>
         </w:r>
         <w:r>
           <w:rPr>
@@ -2232,7 +2232,7 @@
           <w:noProof/>
         </w:rPr>
       </w:pPr>
-      <w:hyperlink w:anchor="_Toc242713028" w:history="1">
+      <w:hyperlink w:anchor="_Toc244100475" w:history="1">
         <w:r>
           <w:rPr>
             <w:rStyle w:val="Hyperlink"/>
@@ -2260,7 +2260,7 @@
             <w:noProof/>
             <w:webHidden/>
           </w:rPr>
-          <w:instrText xml:space="preserve"> PAGEREF _Toc242713028 \h </w:instrText>
+          <w:instrText xml:space="preserve"> PAGEREF _Toc244100475 \h </w:instrText>
         </w:r>
         <w:r>
           <w:rPr>
@@ -2301,7 +2301,7 @@
           <w:noProof/>
         </w:rPr>
       </w:pPr>
-      <w:hyperlink w:anchor="_Toc242713029" w:history="1">
+      <w:hyperlink w:anchor="_Toc244100476" w:history="1">
         <w:r>
           <w:rPr>
             <w:rStyle w:val="Hyperlink"/>
@@ -2329,7 +2329,7 @@
             <w:noProof/>
             <w:webHidden/>
           </w:rPr>
-          <w:instrText xml:space="preserve"> PAGEREF _Toc242713029 \h </w:instrText>
+          <w:instrText xml:space="preserve"> PAGEREF _Toc244100476 \h </w:instrText>
         </w:r>
         <w:r>
           <w:rPr>
@@ -2349,7 +2349,7 @@
             <w:noProof/>
             <w:webHidden/>
           </w:rPr>
-          <w:t>9</w:t>
+          <w:t>8</w:t>
         </w:r>
         <w:r>
           <w:rPr>
@@ -2370,7 +2370,7 @@
           <w:noProof/>
         </w:rPr>
       </w:pPr>
-      <w:hyperlink w:anchor="_Toc242713030" w:history="1">
+      <w:hyperlink w:anchor="_Toc244100477" w:history="1">
         <w:r>
           <w:rPr>
             <w:rStyle w:val="Hyperlink"/>
@@ -2398,7 +2398,7 @@
             <w:noProof/>
             <w:webHidden/>
           </w:rPr>
-          <w:instrText xml:space="preserve"> PAGEREF _Toc242713030 \h </w:instrText>
+          <w:instrText xml:space="preserve"> PAGEREF _Toc244100477 \h </w:instrText>
         </w:r>
         <w:r>
           <w:rPr>
@@ -2439,7 +2439,7 @@
           <w:noProof/>
         </w:rPr>
       </w:pPr>
-      <w:hyperlink w:anchor="_Toc242713031" w:history="1">
+      <w:hyperlink w:anchor="_Toc244100478" w:history="1">
         <w:r>
           <w:rPr>
             <w:rStyle w:val="Hyperlink"/>
@@ -2467,7 +2467,7 @@
             <w:noProof/>
             <w:webHidden/>
           </w:rPr>
-          <w:instrText xml:space="preserve"> PAGEREF _Toc242713031 \h </w:instrText>
+          <w:instrText xml:space="preserve"> PAGEREF _Toc244100478 \h </w:instrText>
         </w:r>
         <w:r>
           <w:rPr>
@@ -2508,7 +2508,7 @@
           <w:noProof/>
         </w:rPr>
       </w:pPr>
-      <w:hyperlink w:anchor="_Toc242713032" w:history="1">
+      <w:hyperlink w:anchor="_Toc244100479" w:history="1">
         <w:r>
           <w:rPr>
             <w:rStyle w:val="Hyperlink"/>
@@ -2536,7 +2536,7 @@
             <w:noProof/>
             <w:webHidden/>
           </w:rPr>
-          <w:instrText xml:space="preserve"> PAGEREF _Toc242713032 \h </w:instrText>
+          <w:instrText xml:space="preserve"> PAGEREF _Toc244100479 \h </w:instrText>
         </w:r>
         <w:r>
           <w:rPr>
@@ -2577,7 +2577,7 @@
           <w:noProof/>
         </w:rPr>
       </w:pPr>
-      <w:hyperlink w:anchor="_Toc242713033" w:history="1">
+      <w:hyperlink w:anchor="_Toc244100480" w:history="1">
         <w:r>
           <w:rPr>
             <w:rStyle w:val="Hyperlink"/>
@@ -2605,7 +2605,7 @@
             <w:noProof/>
             <w:webHidden/>
           </w:rPr>
-          <w:instrText xml:space="preserve"> PAGEREF _Toc242713033 \h </w:instrText>
+          <w:instrText xml:space="preserve"> PAGEREF _Toc244100480 \h </w:instrText>
         </w:r>
         <w:r>
           <w:rPr>
@@ -2646,7 +2646,7 @@
           <w:noProof/>
         </w:rPr>
       </w:pPr>
-      <w:hyperlink w:anchor="_Toc242713034" w:history="1">
+      <w:hyperlink w:anchor="_Toc244100481" w:history="1">
         <w:r>
           <w:rPr>
             <w:rStyle w:val="Hyperlink"/>
@@ -2674,7 +2674,7 @@
             <w:noProof/>
             <w:webHidden/>
           </w:rPr>
-          <w:instrText xml:space="preserve"> PAGEREF _Toc242713034 \h </w:instrText>
+          <w:instrText xml:space="preserve"> PAGEREF _Toc244100481 \h </w:instrText>
         </w:r>
         <w:r>
           <w:rPr>
@@ -2715,7 +2715,7 @@
           <w:noProof/>
         </w:rPr>
       </w:pPr>
-      <w:hyperlink w:anchor="_Toc242713035" w:history="1">
+      <w:hyperlink w:anchor="_Toc244100482" w:history="1">
         <w:r>
           <w:rPr>
             <w:rStyle w:val="Hyperlink"/>
@@ -2743,7 +2743,7 @@
             <w:noProof/>
             <w:webHidden/>
           </w:rPr>
-          <w:instrText xml:space="preserve"> PAGEREF _Toc242713035 \h </w:instrText>
+          <w:instrText xml:space="preserve"> PAGEREF _Toc244100482 \h </w:instrText>
         </w:r>
         <w:r>
           <w:rPr>
@@ -2763,7 +2763,7 @@
             <w:noProof/>
             <w:webHidden/>
           </w:rPr>
-          <w:t>11</w:t>
+          <w:t>10</w:t>
         </w:r>
         <w:r>
           <w:rPr>
@@ -2784,7 +2784,7 @@
           <w:noProof/>
         </w:rPr>
       </w:pPr>
-      <w:hyperlink w:anchor="_Toc242713036" w:history="1">
+      <w:hyperlink w:anchor="_Toc244100483" w:history="1">
         <w:r>
           <w:rPr>
             <w:rStyle w:val="Hyperlink"/>
@@ -2812,7 +2812,7 @@
             <w:noProof/>
             <w:webHidden/>
           </w:rPr>
-          <w:instrText xml:space="preserve"> PAGEREF _Toc242713036 \h </w:instrText>
+          <w:instrText xml:space="preserve"> PAGEREF _Toc244100483 \h </w:instrText>
         </w:r>
         <w:r>
           <w:rPr>
@@ -2853,7 +2853,7 @@
           <w:noProof/>
         </w:rPr>
       </w:pPr>
-      <w:hyperlink w:anchor="_Toc242713037" w:history="1">
+      <w:hyperlink w:anchor="_Toc244100484" w:history="1">
         <w:r>
           <w:rPr>
             <w:rStyle w:val="Hyperlink"/>
@@ -2881,7 +2881,7 @@
             <w:noProof/>
             <w:webHidden/>
           </w:rPr>
-          <w:instrText xml:space="preserve"> PAGEREF _Toc242713037 \h </w:instrText>
+          <w:instrText xml:space="preserve"> PAGEREF _Toc244100484 \h </w:instrText>
         </w:r>
         <w:r>
           <w:rPr>
@@ -2922,7 +2922,7 @@
           <w:noProof/>
         </w:rPr>
       </w:pPr>
-      <w:hyperlink w:anchor="_Toc242713038" w:history="1">
+      <w:hyperlink w:anchor="_Toc244100485" w:history="1">
         <w:r>
           <w:rPr>
             <w:rStyle w:val="Hyperlink"/>
@@ -2950,7 +2950,7 @@
             <w:noProof/>
             <w:webHidden/>
           </w:rPr>
-          <w:instrText xml:space="preserve"> PAGEREF _Toc242713038 \h </w:instrText>
+          <w:instrText xml:space="preserve"> PAGEREF _Toc244100485 \h </w:instrText>
         </w:r>
         <w:r>
           <w:rPr>
@@ -2991,7 +2991,7 @@
           <w:noProof/>
         </w:rPr>
       </w:pPr>
-      <w:hyperlink w:anchor="_Toc242713039" w:history="1">
+      <w:hyperlink w:anchor="_Toc244100486" w:history="1">
         <w:r>
           <w:rPr>
             <w:rStyle w:val="Hyperlink"/>
@@ -3019,7 +3019,7 @@
             <w:noProof/>
             <w:webHidden/>
           </w:rPr>
-          <w:instrText xml:space="preserve"> PAGEREF _Toc242713039 \h </w:instrText>
+          <w:instrText xml:space="preserve"> PAGEREF _Toc244100486 \h </w:instrText>
         </w:r>
         <w:r>
           <w:rPr>
@@ -3060,7 +3060,7 @@
           <w:noProof/>
         </w:rPr>
       </w:pPr>
-      <w:hyperlink w:anchor="_Toc242713040" w:history="1">
+      <w:hyperlink w:anchor="_Toc244100487" w:history="1">
         <w:r>
           <w:rPr>
             <w:rStyle w:val="Hyperlink"/>
@@ -3088,7 +3088,7 @@
             <w:noProof/>
             <w:webHidden/>
           </w:rPr>
-          <w:instrText xml:space="preserve"> PAGEREF _Toc242713040 \h </w:instrText>
+          <w:instrText xml:space="preserve"> PAGEREF _Toc244100487 \h </w:instrText>
         </w:r>
         <w:r>
           <w:rPr>
@@ -3129,7 +3129,7 @@
           <w:noProof/>
         </w:rPr>
       </w:pPr>
-      <w:hyperlink w:anchor="_Toc242713041" w:history="1">
+      <w:hyperlink w:anchor="_Toc244100488" w:history="1">
         <w:r>
           <w:rPr>
             <w:rStyle w:val="Hyperlink"/>
@@ -3157,7 +3157,7 @@
             <w:noProof/>
             <w:webHidden/>
           </w:rPr>
-          <w:instrText xml:space="preserve"> PAGEREF _Toc242713041 \h </w:instrText>
+          <w:instrText xml:space="preserve"> PAGEREF _Toc244100488 \h </w:instrText>
         </w:r>
         <w:r>
           <w:rPr>
@@ -3198,7 +3198,7 @@
           <w:noProof/>
         </w:rPr>
       </w:pPr>
-      <w:hyperlink w:anchor="_Toc242713042" w:history="1">
+      <w:hyperlink w:anchor="_Toc244100489" w:history="1">
         <w:r>
           <w:rPr>
             <w:rStyle w:val="Hyperlink"/>
@@ -3226,7 +3226,7 @@
             <w:noProof/>
             <w:webHidden/>
           </w:rPr>
-          <w:instrText xml:space="preserve"> PAGEREF _Toc242713042 \h </w:instrText>
+          <w:instrText xml:space="preserve"> PAGEREF _Toc244100489 \h </w:instrText>
         </w:r>
         <w:r>
           <w:rPr>
@@ -3267,7 +3267,7 @@
           <w:noProof/>
         </w:rPr>
       </w:pPr>
-      <w:hyperlink w:anchor="_Toc242713043" w:history="1">
+      <w:hyperlink w:anchor="_Toc244100490" w:history="1">
         <w:r>
           <w:rPr>
             <w:rStyle w:val="Hyperlink"/>
@@ -3295,7 +3295,7 @@
             <w:noProof/>
             <w:webHidden/>
           </w:rPr>
-          <w:instrText xml:space="preserve"> PAGEREF _Toc242713043 \h </w:instrText>
+          <w:instrText xml:space="preserve"> PAGEREF _Toc244100490 \h </w:instrText>
         </w:r>
         <w:r>
           <w:rPr>
@@ -3336,7 +3336,7 @@
           <w:noProof/>
         </w:rPr>
       </w:pPr>
-      <w:hyperlink w:anchor="_Toc242713044" w:history="1">
+      <w:hyperlink w:anchor="_Toc244100491" w:history="1">
         <w:r>
           <w:rPr>
             <w:rStyle w:val="Hyperlink"/>
@@ -3364,7 +3364,7 @@
             <w:noProof/>
             <w:webHidden/>
           </w:rPr>
-          <w:instrText xml:space="preserve"> PAGEREF _Toc242713044 \h </w:instrText>
+          <w:instrText xml:space="preserve"> PAGEREF _Toc244100491 \h </w:instrText>
         </w:r>
         <w:r>
           <w:rPr>
@@ -3405,7 +3405,7 @@
           <w:noProof/>
         </w:rPr>
       </w:pPr>
-      <w:hyperlink w:anchor="_Toc242713045" w:history="1">
+      <w:hyperlink w:anchor="_Toc244100492" w:history="1">
         <w:r>
           <w:rPr>
             <w:rStyle w:val="Hyperlink"/>
@@ -3433,7 +3433,7 @@
             <w:noProof/>
             <w:webHidden/>
           </w:rPr>
-          <w:instrText xml:space="preserve"> PAGEREF _Toc242713045 \h </w:instrText>
+          <w:instrText xml:space="preserve"> PAGEREF _Toc244100492 \h </w:instrText>
         </w:r>
         <w:r>
           <w:rPr>
@@ -3474,7 +3474,7 @@
           <w:noProof/>
         </w:rPr>
       </w:pPr>
-      <w:hyperlink w:anchor="_Toc242713046" w:history="1">
+      <w:hyperlink w:anchor="_Toc244100493" w:history="1">
         <w:r>
           <w:rPr>
             <w:rStyle w:val="Hyperlink"/>
@@ -3502,7 +3502,7 @@
             <w:noProof/>
             <w:webHidden/>
           </w:rPr>
-          <w:instrText xml:space="preserve"> PAGEREF _Toc242713046 \h </w:instrText>
+          <w:instrText xml:space="preserve"> PAGEREF _Toc244100493 \h </w:instrText>
         </w:r>
         <w:r>
           <w:rPr>
@@ -3543,7 +3543,7 @@
           <w:noProof/>
         </w:rPr>
       </w:pPr>
-      <w:hyperlink w:anchor="_Toc242713047" w:history="1">
+      <w:hyperlink w:anchor="_Toc244100494" w:history="1">
         <w:r>
           <w:rPr>
             <w:rStyle w:val="Hyperlink"/>
@@ -3571,7 +3571,7 @@
             <w:noProof/>
             <w:webHidden/>
           </w:rPr>
-          <w:instrText xml:space="preserve"> PAGEREF _Toc242713047 \h </w:instrText>
+          <w:instrText xml:space="preserve"> PAGEREF _Toc244100494 \h </w:instrText>
         </w:r>
         <w:r>
           <w:rPr>
@@ -3621,7 +3621,7 @@
       <w:pPr>
         <w:pStyle w:val="Heading1"/>
       </w:pPr>
-      <w:bookmarkStart w:id="1" w:name="_Toc242713002"/>
+      <w:bookmarkStart w:id="1" w:name="_Toc244100449"/>
       <w:r>
         <w:lastRenderedPageBreak/>
         <w:t>Chương 1. Giới thiệu và câu hỏi nghiệp vụ</w:t>
@@ -3632,7 +3632,7 @@
       <w:pPr>
         <w:pStyle w:val="Heading2"/>
       </w:pPr>
-      <w:bookmarkStart w:id="2" w:name="_Toc242713003"/>
+      <w:bookmarkStart w:id="2" w:name="_Toc244100450"/>
       <w:r>
         <w:t>1.1. Bối cảnh</w:t>
       </w:r>
@@ -3656,7 +3656,7 @@
       <w:pPr>
         <w:pStyle w:val="Heading2"/>
       </w:pPr>
-      <w:bookmarkStart w:id="3" w:name="_Toc242713004"/>
+      <w:bookmarkStart w:id="3" w:name="_Toc244100451"/>
       <w:r>
         <w:t>1.2. Câu hỏi nghiệp vụ</w:t>
       </w:r>
@@ -3771,7 +3771,7 @@
       <w:pPr>
         <w:pStyle w:val="Heading2"/>
       </w:pPr>
-      <w:bookmarkStart w:id="4" w:name="_Toc242713005"/>
+      <w:bookmarkStart w:id="4" w:name="_Toc244100452"/>
       <w:r>
         <w:t>1.3. Phạm vi công việc</w:t>
       </w:r>
@@ -4155,7 +4155,7 @@
       <w:pPr>
         <w:pStyle w:val="Heading2"/>
       </w:pPr>
-      <w:bookmarkStart w:id="5" w:name="_Toc242713006"/>
+      <w:bookmarkStart w:id="5" w:name="_Toc244100453"/>
       <w:r>
         <w:lastRenderedPageBreak/>
         <w:t>1.4. Kiến trúc và công cụ</w:t>
@@ -4235,7 +4235,7 @@
       <w:pPr>
         <w:pStyle w:val="Heading1"/>
       </w:pPr>
-      <w:bookmarkStart w:id="6" w:name="_Toc242713007"/>
+      <w:bookmarkStart w:id="6" w:name="_Toc244100454"/>
       <w:r>
         <w:t>Chương 2. Thu thập và tiền xử lý dữ liệu</w:t>
       </w:r>
@@ -4245,7 +4245,7 @@
       <w:pPr>
         <w:pStyle w:val="Heading2"/>
       </w:pPr>
-      <w:bookmarkStart w:id="7" w:name="_Toc242713008"/>
+      <w:bookmarkStart w:id="7" w:name="_Toc244100455"/>
       <w:r>
         <w:t>2.1. Nguồn dữ liệu và giấy phép</w:t>
       </w:r>
@@ -4613,7 +4613,7 @@
       <w:pPr>
         <w:pStyle w:val="Heading2"/>
       </w:pPr>
-      <w:bookmarkStart w:id="8" w:name="_Toc242713009"/>
+      <w:bookmarkStart w:id="8" w:name="_Toc244100456"/>
       <w:r>
         <w:t>2.2. Các thuộc tính</w:t>
       </w:r>
@@ -5044,7 +5044,7 @@
       <w:pPr>
         <w:pStyle w:val="Heading2"/>
       </w:pPr>
-      <w:bookmarkStart w:id="9" w:name="_Toc242713010"/>
+      <w:bookmarkStart w:id="9" w:name="_Toc244100457"/>
       <w:r>
         <w:t>2.3. Tỷ lệ giá trị thiếu và cách xử lý từng cột</w:t>
       </w:r>
@@ -6483,7 +6483,7 @@
       <w:pPr>
         <w:pStyle w:val="Heading2"/>
       </w:pPr>
-      <w:bookmarkStart w:id="10" w:name="_Toc242713011"/>
+      <w:bookmarkStart w:id="10" w:name="_Toc244100458"/>
       <w:r>
         <w:t>2.4. Làm sạch và chuẩn hoá</w:t>
       </w:r>
@@ -6579,7 +6579,7 @@
       <w:pPr>
         <w:pStyle w:val="Heading2"/>
       </w:pPr>
-      <w:bookmarkStart w:id="11" w:name="_Toc242713012"/>
+      <w:bookmarkStart w:id="11" w:name="_Toc244100459"/>
       <w:r>
         <w:lastRenderedPageBreak/>
         <w:t>2.5. Khám phá dữ liệu</w:t>
@@ -6659,7 +6659,7 @@
       <w:pPr>
         <w:pStyle w:val="Heading1"/>
       </w:pPr>
-      <w:bookmarkStart w:id="12" w:name="_Toc242713013"/>
+      <w:bookmarkStart w:id="12" w:name="_Toc244100460"/>
       <w:r>
         <w:t>Chương 3. Thiết kế kho dữ liệu</w:t>
       </w:r>
@@ -6669,7 +6669,7 @@
       <w:pPr>
         <w:pStyle w:val="Heading2"/>
       </w:pPr>
-      <w:bookmarkStart w:id="13" w:name="_Toc242713014"/>
+      <w:bookmarkStart w:id="13" w:name="_Toc244100461"/>
       <w:r>
         <w:t>3.1. Lược đồ hình sao</w:t>
       </w:r>
@@ -6734,7 +6734,7 @@
       <w:pPr>
         <w:pStyle w:val="Heading2"/>
       </w:pPr>
-      <w:bookmarkStart w:id="14" w:name="_Toc242713015"/>
+      <w:bookmarkStart w:id="14" w:name="_Toc244100462"/>
       <w:r>
         <w:lastRenderedPageBreak/>
         <w:t>3.2. Bảng sự kiện và độ mịn</w:t>
@@ -6826,7 +6826,7 @@
       <w:pPr>
         <w:pStyle w:val="Heading2"/>
       </w:pPr>
-      <w:bookmarkStart w:id="15" w:name="_Toc242713016"/>
+      <w:bookmarkStart w:id="15" w:name="_Toc244100463"/>
       <w:r>
         <w:t>3.3. Các chiều và phân cấp khái niệm</w:t>
       </w:r>
@@ -7237,7 +7237,7 @@
       <w:pPr>
         <w:pStyle w:val="Heading2"/>
       </w:pPr>
-      <w:bookmarkStart w:id="16" w:name="_Toc242713017"/>
+      <w:bookmarkStart w:id="16" w:name="_Toc244100464"/>
       <w:r>
         <w:t>3.4. Độ đo</w:t>
       </w:r>
@@ -7258,7 +7258,7 @@
       <w:pPr>
         <w:pStyle w:val="Heading2"/>
       </w:pPr>
-      <w:bookmarkStart w:id="17" w:name="_Toc242713018"/>
+      <w:bookmarkStart w:id="17" w:name="_Toc244100465"/>
       <w:r>
         <w:t>3.5. Số khối con</w:t>
       </w:r>
@@ -7279,7 +7279,7 @@
       <w:pPr>
         <w:pStyle w:val="Heading1"/>
       </w:pPr>
-      <w:bookmarkStart w:id="18" w:name="_Toc242713019"/>
+      <w:bookmarkStart w:id="18" w:name="_Toc244100466"/>
       <w:r>
         <w:lastRenderedPageBreak/>
         <w:t>Chương 4. Cài đặt kho dữ liệu và tính trước khối dữ liệu</w:t>
@@ -7290,7 +7290,7 @@
       <w:pPr>
         <w:pStyle w:val="Heading2"/>
       </w:pPr>
-      <w:bookmarkStart w:id="19" w:name="_Toc242713020"/>
+      <w:bookmarkStart w:id="19" w:name="_Toc244100467"/>
       <w:r>
         <w:t>4.1. Quy trình nạp dữ liệu</w:t>
       </w:r>
@@ -7772,7 +7772,7 @@
       <w:pPr>
         <w:pStyle w:val="Heading2"/>
       </w:pPr>
-      <w:bookmarkStart w:id="20" w:name="_Toc242713021"/>
+      <w:bookmarkStart w:id="20" w:name="_Toc244100468"/>
       <w:r>
         <w:t>4.2. Các khối được tính trước và lý do chọn</w:t>
       </w:r>
@@ -8120,7 +8120,7 @@
       <w:pPr>
         <w:pStyle w:val="Heading2"/>
       </w:pPr>
-      <w:bookmarkStart w:id="21" w:name="_Toc242713022"/>
+      <w:bookmarkStart w:id="21" w:name="_Toc244100469"/>
       <w:r>
         <w:t>4.3. Kiểm chứng tính đúng của khối dữ liệu</w:t>
       </w:r>
@@ -8612,7 +8612,7 @@
       <w:pPr>
         <w:pStyle w:val="Heading2"/>
       </w:pPr>
-      <w:bookmarkStart w:id="22" w:name="_Toc242713023"/>
+      <w:bookmarkStart w:id="22" w:name="_Toc244100470"/>
       <w:r>
         <w:lastRenderedPageBreak/>
         <w:t>4.4. Chạy lại từ đầu bằng một lệnh</w:t>
@@ -8634,7 +8634,7 @@
       <w:pPr>
         <w:pStyle w:val="Heading1"/>
       </w:pPr>
-      <w:bookmarkStart w:id="23" w:name="_Toc242713024"/>
+      <w:bookmarkStart w:id="23" w:name="_Toc244100471"/>
       <w:r>
         <w:t>Chương 5. Dịch vụ phân tích trực tuyến (OLAP)</w:t>
       </w:r>
@@ -8655,7 +8655,7 @@
       <w:pPr>
         <w:pStyle w:val="Heading2"/>
       </w:pPr>
-      <w:bookmarkStart w:id="24" w:name="_Toc242713025"/>
+      <w:bookmarkStart w:id="24" w:name="_Toc244100472"/>
       <w:r>
         <w:t>5.1. Roll-up — cuộn lên</w:t>
       </w:r>
@@ -9040,7 +9040,7 @@
       <w:pPr>
         <w:pStyle w:val="Heading2"/>
       </w:pPr>
-      <w:bookmarkStart w:id="25" w:name="_Toc242713026"/>
+      <w:bookmarkStart w:id="25" w:name="_Toc244100473"/>
       <w:r>
         <w:t>5.2. Drill-down — khoan xuống</w:t>
       </w:r>
@@ -9670,7 +9670,7 @@
       <w:pPr>
         <w:pStyle w:val="Heading2"/>
       </w:pPr>
-      <w:bookmarkStart w:id="26" w:name="_Toc242713027"/>
+      <w:bookmarkStart w:id="26" w:name="_Toc244100474"/>
       <w:r>
         <w:lastRenderedPageBreak/>
         <w:t>5.3. Slice và dice</w:t>
@@ -10261,7 +10261,7 @@
       <w:pPr>
         <w:pStyle w:val="Heading2"/>
       </w:pPr>
-      <w:bookmarkStart w:id="27" w:name="_Toc242713028"/>
+      <w:bookmarkStart w:id="27" w:name="_Toc244100475"/>
       <w:r>
         <w:t>5.4. Pivot — xoay trục</w:t>
       </w:r>
@@ -10278,7 +10278,7 @@
         </w:rPr>
         <w:drawing>
           <wp:inline distT="0" distB="0" distL="0" distR="0">
-            <wp:extent cx="5580000" cy="4843750"/>
+            <wp:extent cx="5580000" cy="2657143"/>
             <wp:effectExtent l="0" t="0" r="0" b="0"/>
             <wp:docPr id="4" name="Picture 4"/>
             <wp:cNvGraphicFramePr>
@@ -10300,7 +10300,7 @@
                   <pic:spPr>
                     <a:xfrm>
                       <a:off x="0" y="0"/>
-                      <a:ext cx="5580000" cy="4843750"/>
+                      <a:ext cx="5580000" cy="2657143"/>
                     </a:xfrm>
                     <a:prstGeom prst="rect">
                       <a:avLst/>
@@ -10330,21 +10330,17 @@
         <w:t>Pivot giữ nguyên d</w:t>
       </w:r>
       <w:r>
-        <w:t xml:space="preserve">ữ liệu, chỉ đổi khung nhìn: đưa trạm lên hàng và tháng sang cột (câu pivot_station_month dùng FILTER), hoặc ngược lại. Trên dashboard, bấm vào </w:t>
-      </w:r>
-      <w:r>
-        <w:lastRenderedPageBreak/>
-        <w:t>một dòng sẽ khoan xuống mức con; tổng hàng/cột được sinh bằng GROUPING SETS và câu SQL sinh ra được hiển thị để k</w:t>
-      </w:r>
-      <w:r>
-        <w:t>iểm tra.</w:t>
+        <w:t>ữ liệu, chỉ đổi khung nhìn: đưa trạm lên hàng và tháng sang cột (câu pivot_station_month dùng FILTER), hoặc ngược lại. Trên dashboard, bấm tên một hàng hoặc một cột sẽ khoan xuống mức con; tổng hàng/cột được sinh bằng GROUPING SETS và trạng thái khung nhìn</w:t>
+      </w:r>
+      <w:r>
+        <w:t xml:space="preserve"> được giữ trên URL để mở lại đúng khối đó.</w:t>
       </w:r>
     </w:p>
     <w:p>
       <w:pPr>
         <w:pStyle w:val="Heading2"/>
       </w:pPr>
-      <w:bookmarkStart w:id="28" w:name="_Toc242713029"/>
+      <w:bookmarkStart w:id="28" w:name="_Toc244100476"/>
       <w:r>
         <w:t>5.5. CUBE và trả lời từ khối đã tính trước</w:t>
       </w:r>
@@ -10355,10 +10351,10 @@
         <w:jc w:val="both"/>
       </w:pPr>
       <w:r>
-        <w:t>GROUP BY CUBE(season, wind_regime) cho ra 2² = 4 khối con (đủ tổ hợp, các tổng con và tổng toàn bộ). Truy vấn năm × mùa đọc từ khối con (year, season) của mart_olap_cube mất khoảng 24 ms, so với khoảng 18</w:t>
-      </w:r>
-      <w:r>
-        <w:t>0 ms khi quét bảng sự kiện (đo trong notebook).</w:t>
+        <w:t xml:space="preserve">GROUP BY CUBE(season, wind_regime) cho ra 2² = 4 khối con (đủ tổ hợp, các tổng con và tổng toàn bộ). Truy vấn năm × mùa đọc từ khối con (year, season) của mart_olap_cube </w:t>
+      </w:r>
+      <w:r>
+        <w:t>mất khoảng 24 ms, so với khoảng 180 ms khi quét bảng sự kiện (đo trong notebook).</w:t>
       </w:r>
     </w:p>
     <w:p>
@@ -10370,9 +10366,10 @@
         <w:rPr>
           <w:noProof/>
         </w:rPr>
+        <w:lastRenderedPageBreak/>
         <w:drawing>
           <wp:inline distT="0" distB="0" distL="0" distR="0">
-            <wp:extent cx="4680000" cy="4062500"/>
+            <wp:extent cx="4680000" cy="2730000"/>
             <wp:effectExtent l="0" t="0" r="0" b="0"/>
             <wp:docPr id="5" name="Picture 5"/>
             <wp:cNvGraphicFramePr>
@@ -10394,7 +10391,7 @@
                   <pic:spPr>
                     <a:xfrm>
                       <a:off x="0" y="0"/>
-                      <a:ext cx="4680000" cy="4062500"/>
+                      <a:ext cx="4680000" cy="2730000"/>
                     </a:xfrm>
                     <a:prstGeom prst="rect">
                       <a:avLst/>
@@ -10420,7 +10417,7 @@
       <w:pPr>
         <w:pStyle w:val="Heading1"/>
       </w:pPr>
-      <w:bookmarkStart w:id="29" w:name="_Toc242713030"/>
+      <w:bookmarkStart w:id="29" w:name="_Toc244100477"/>
       <w:r>
         <w:t>Chương 6. Khai phá dữ liệu: phân loại cảnh báo vượt ngưỡng</w:t>
       </w:r>
@@ -10430,7 +10427,7 @@
       <w:pPr>
         <w:pStyle w:val="Heading2"/>
       </w:pPr>
-      <w:bookmarkStart w:id="30" w:name="_Toc242713031"/>
+      <w:bookmarkStart w:id="30" w:name="_Toc244100478"/>
       <w:r>
         <w:t>6.1. Nhận diện bài toán</w:t>
       </w:r>
@@ -10441,20 +10438,20 @@
         <w:jc w:val="both"/>
       </w:pPr>
       <w:r>
-        <w:t>Quyết định của người dùng là nhị phân (cảnh báo /</w:t>
-      </w:r>
-      <w:r>
-        <w:t xml:space="preserve"> không cảnh báo) và hai loại sai có chi phí khác nhau: bỏ sót một giờ ô nhiễm (FN) nguy hiểm hơn báo nhầm (FP). Vì vậy bài toán được chọn là phân loại và được đánh giá bằng ma trận nhầm lẫn. Phân cụm không trả lời được câu hỏi "có cảnh báo không"; luật kết</w:t>
-      </w:r>
-      <w:r>
-        <w:t xml:space="preserve"> hợp phù hợp với dữ liệu giao dịch, không phải chuỗi thời gian đo liên tục.</w:t>
+        <w:t xml:space="preserve">Quyết định của </w:t>
+      </w:r>
+      <w:r>
+        <w:t>người dùng là nhị phân (cảnh báo / không cảnh báo) và hai loại sai có chi phí khác nhau: bỏ sót một giờ ô nhiễm (FN) nguy hiểm hơn báo nhầm (FP). Vì vậy bài toán được chọn là phân loại và được đánh giá bằng ma trận nhầm lẫn. Phân cụm không trả lời được câu</w:t>
+      </w:r>
+      <w:r>
+        <w:t xml:space="preserve"> hỏi "có cảnh báo không"; luật kết hợp phù hợp với dữ liệu giao dịch, không phải chuỗi thời gian đo liên tục.</w:t>
       </w:r>
     </w:p>
     <w:p>
       <w:pPr>
         <w:pStyle w:val="Heading2"/>
       </w:pPr>
-      <w:bookmarkStart w:id="31" w:name="_Toc242713032"/>
+      <w:bookmarkStart w:id="31" w:name="_Toc244100479"/>
       <w:r>
         <w:t>6.2. Dữ liệu huấn luyện</w:t>
       </w:r>
@@ -10486,14 +10483,13 @@
         <w:rPr>
           <w:b/>
         </w:rPr>
-        <w:lastRenderedPageBreak/>
-        <w:t xml:space="preserve">Đặc trưng (49): </w:t>
-      </w:r>
-      <w:r>
-        <w:t>chỉ dùng thông tin biết tại thời điểm t. Gồm PM2.5 h</w:t>
-      </w:r>
-      <w:r>
-        <w:t>iện tại, độ trễ 1–24 giờ, trung bình trượt 6/24 giờ, mức thay đổi trong giờ; PM10, CO, NO2 và độ trễ của chúng; nhiệt độ, độ ẩm, tốc độ gió; giờ, tháng, thứ, mùa, trạm, cụm trạm; số giờ đã ở trong đợt ô nhiễm.</w:t>
+        <w:t xml:space="preserve">Đặc trưng (45): </w:t>
+      </w:r>
+      <w:r>
+        <w:t>chỉ dùng thông tin</w:t>
+      </w:r>
+      <w:r>
+        <w:t xml:space="preserve"> biết tại thời điểm t. Gồm PM2.5 hiện tại, độ trễ 1–24 giờ, trung bình trượt 6/24 giờ, mức thay đổi trong giờ; PM10, CO, NO2 và độ trễ của chúng; nhiệt độ, độ ẩm, tốc độ gió; giờ, tháng, thứ, mùa, trạm, cụm trạm; số giờ đã ở trong đợt ô nhiễm.</w:t>
       </w:r>
     </w:p>
     <w:p>
@@ -10506,13 +10502,16 @@
         <w:rPr>
           <w:b/>
         </w:rPr>
-        <w:t xml:space="preserve">Chia tập theo thời gian, khoá từ đầu: </w:t>
-      </w:r>
-      <w:r>
-        <w:t>không tr</w:t>
-      </w:r>
-      <w:r>
-        <w:t>ộn ngẫu nhiên, để mô hình không "nhìn thấy tương lai". Median để điền giá trị thiếu chỉ tính trên tập train.</w:t>
+        <w:t>Chia tập the</w:t>
+      </w:r>
+      <w:r>
+        <w:rPr>
+          <w:b/>
+        </w:rPr>
+        <w:t xml:space="preserve">o thời gian, khoá từ đầu: </w:t>
+      </w:r>
+      <w:r>
+        <w:t>không trộn ngẫu nhiên, để mô hình không "nhìn thấy tương lai". Median để điền giá trị thiếu chỉ tính trên tập train.</w:t>
       </w:r>
     </w:p>
     <w:p>
@@ -10840,8 +10839,9 @@
       <w:pPr>
         <w:pStyle w:val="Heading2"/>
       </w:pPr>
-      <w:bookmarkStart w:id="32" w:name="_Toc242713033"/>
-      <w:r>
+      <w:bookmarkStart w:id="32" w:name="_Toc244100480"/>
+      <w:r>
+        <w:lastRenderedPageBreak/>
         <w:t>6.3. Mô hình và cách chọn</w:t>
       </w:r>
       <w:bookmarkEnd w:id="32"/>
@@ -10875,10 +10875,10 @@
         <w:t xml:space="preserve">Cây quyết định </w:t>
       </w:r>
       <w:r>
-        <w:t xml:space="preserve">với tiêu chí entropy (độ lợi thông tin, đúng như Bài 8). Độ sâu chọn trên tập val </w:t>
-      </w:r>
-      <w:r>
-        <w:t>trong {3, 4, 5, 6, 8, 10}; giá trị được chọn là 6, mỗi lá tối thiểu 200 mẫu để tránh quá khớp.</w:t>
+        <w:t>với tiêu chí entropy (độ lợi thông tin, đúng như Bài</w:t>
+      </w:r>
+      <w:r>
+        <w:t xml:space="preserve"> 8). Độ sâu chọn trên tập val trong {3, 4, 5, 6, 8, 10}; giá trị được chọn là 6, mỗi lá tối thiểu 200 mẫu để tránh quá khớp.</w:t>
       </w:r>
     </w:p>
     <w:p>
@@ -10910,17 +10910,17 @@
         <w:t xml:space="preserve">Ngưỡng xác suất </w:t>
       </w:r>
       <w:r>
-        <w:t xml:space="preserve">cũng được chọn trên val: 0,45 với cây quyết định và </w:t>
-      </w:r>
-      <w:r>
-        <w:t>0,50 với HistGB. Mô hình khoá là mô hình có F1 trên val cao nhất: HistGradientBoosting. Tập test chỉ được dùng một lần để báo cáo.</w:t>
+        <w:t>cũng được chọn trên va</w:t>
+      </w:r>
+      <w:r>
+        <w:t>l: 0,45 với cây quyết định và 0,50 với HistGB. Mô hình khoá là mô hình có F1 trên val cao nhất: HistGradientBoosting. Tập test chỉ được dùng một lần để báo cáo.</w:t>
       </w:r>
     </w:p>
     <w:p>
       <w:pPr>
         <w:pStyle w:val="Heading2"/>
       </w:pPr>
-      <w:bookmarkStart w:id="33" w:name="_Toc242713034"/>
+      <w:bookmarkStart w:id="33" w:name="_Toc244100481"/>
       <w:r>
         <w:t>6.4. Kết quả trên tập test</w:t>
       </w:r>
@@ -11082,14 +11082,7 @@
                 <w:b/>
                 <w:sz w:val="19"/>
               </w:rPr>
-              <w:t>P</w:t>
-            </w:r>
-            <w:r>
-              <w:rPr>
-                <w:b/>
-                <w:sz w:val="19"/>
-              </w:rPr>
-              <w:t>recision</w:t>
+              <w:t>Precision</w:t>
             </w:r>
           </w:p>
         </w:tc>
@@ -11824,18 +11817,17 @@
         <w:jc w:val="both"/>
       </w:pPr>
       <w:r>
-        <w:lastRenderedPageBreak/>
-        <w:t xml:space="preserve">Mô hình majority đạt accuracy 0,761 nhưng không phát được cảnh báo nào (recall = 0). Đây là lý do không báo cáo accuracy đơn lẻ. HistGB giảm số </w:t>
-      </w:r>
-      <w:r>
-        <w:t>giờ bỏ sót từ 1.000 xuống 838 và số lần báo nhầm từ 999 xuống 865.</w:t>
+        <w:t xml:space="preserve">Mô hình majority đạt accuracy 0,761 nhưng không phát được cảnh báo nào (recall = 0). Đây là lý do không báo cáo accuracy đơn lẻ. </w:t>
+      </w:r>
+      <w:r>
+        <w:t>HistGB giảm số giờ bỏ sót từ 1.000 xuống 838, số lần báo nhầm từ 999 xuống 865.</w:t>
       </w:r>
     </w:p>
     <w:p>
       <w:pPr>
         <w:pStyle w:val="Heading2"/>
       </w:pPr>
-      <w:bookmarkStart w:id="34" w:name="_Toc242713035"/>
+      <w:bookmarkStart w:id="34" w:name="_Toc244100482"/>
       <w:r>
         <w:t>6.5. Bằng chứng mô hình tốt hơn cách làm hiện tại</w:t>
       </w:r>
@@ -11854,10 +11846,10 @@
         <w:t xml:space="preserve">Phát hiện thời điểm bắt đầu đợt ô nhiễm: </w:t>
       </w:r>
       <w:r>
-        <w:t xml:space="preserve">trong 1.000 giờ "đang sạch nhưng giờ sau vượt ngưỡng", HistGB báo trước được 304 giờ (30,4%); cây </w:t>
-      </w:r>
-      <w:r>
-        <w:t>quyết định báo trước được 19,7%; persistence 0% theo định nghĩa.</w:t>
+        <w:t xml:space="preserve">trong 1.000 giờ "đang sạch nhưng giờ sau vượt ngưỡng", HistGB báo trước được 304 giờ </w:t>
+      </w:r>
+      <w:r>
+        <w:t>(30,4%); cây quyết định báo trước được 19,7%; persistence 0% theo định nghĩa.</w:t>
       </w:r>
     </w:p>
     <w:p>
@@ -11889,10 +11881,10 @@
         <w:t xml:space="preserve">Theo trạm: </w:t>
       </w:r>
       <w:r>
-        <w:t>F1 của mô hình cao hơn</w:t>
-      </w:r>
-      <w:r>
-        <w:t xml:space="preserve"> persistence ở 12/12 trạm.</w:t>
+        <w:t>F1 của mô</w:t>
+      </w:r>
+      <w:r>
+        <w:t xml:space="preserve"> hình cao hơn persistence ở 12/12 trạm.</w:t>
       </w:r>
     </w:p>
     <w:p>
@@ -11902,6 +11894,7 @@
         <w:jc w:val="center"/>
       </w:pPr>
       <w:r>
+        <w:lastRenderedPageBreak/>
         <w:t>Bảng 6.3. Độ nhạy theo tầm cảnh báo (tập test)</w:t>
       </w:r>
     </w:p>
@@ -12238,7 +12231,13 @@
               <w:rPr>
                 <w:sz w:val="21"/>
               </w:rPr>
-              <w:t>0,807 → 0,793</w:t>
+              <w:t xml:space="preserve">0,807 → </w:t>
+            </w:r>
+            <w:r>
+              <w:rPr>
+                <w:sz w:val="21"/>
+              </w:rPr>
+              <w:t>0,793</w:t>
             </w:r>
           </w:p>
         </w:tc>
@@ -12358,10 +12357,10 @@
         <w:jc w:val="both"/>
       </w:pPr>
       <w:r>
-        <w:t>Cảnh báo càng sớm thì lợi thế của mô hình càng lớn: ở tầm 6 giờ, F1 tăng 0,043. Lợi thế này chủ yếu đến từ recall (bắt được nhiều đợt hơn); đổi lại, precision thấp hơn persistence một chút, tức có nhiều cảnh</w:t>
-      </w:r>
-      <w:r>
-        <w:t xml:space="preserve"> báo nhầm hơn. Đây là đánh đổi mà người ra quyết định cần biết.</w:t>
+        <w:t xml:space="preserve">Cảnh báo càng sớm thì lợi thế của mô hình càng lớn: ở tầm 6 giờ, F1 tăng 0,043. Lợi thế này chủ yếu đến từ recall (bắt được nhiều đợt hơn); đổi lại, precision thấp hơn persistence một chút, tức </w:t>
+      </w:r>
+      <w:r>
+        <w:t>có nhiều cảnh báo nhầm hơn. Đây là đánh đổi mà người ra quyết định cần biết.</w:t>
       </w:r>
     </w:p>
     <w:p>
@@ -12423,7 +12422,7 @@
       <w:pPr>
         <w:pStyle w:val="Heading2"/>
       </w:pPr>
-      <w:bookmarkStart w:id="35" w:name="_Toc242713036"/>
+      <w:bookmarkStart w:id="35" w:name="_Toc244100483"/>
       <w:r>
         <w:t>6.6. Diễn giải mô hình</w:t>
       </w:r>
@@ -12434,17 +12433,13 @@
         <w:jc w:val="both"/>
       </w:pPr>
       <w:r>
-        <w:t>Cây quyết định cho thấy PM2.5 hiện tại chiếm 97,4% độ quan trọng; tiếp theo là mức tha</w:t>
-      </w:r>
-      <w:r>
-        <w:t xml:space="preserve">y đổi trong giờ vừa qua (1,5%) và tốc độ gió (0,5%). Nút gốc tách tại PM2.5 ≈ 110 </w:t>
-      </w:r>
-      <w:r>
-        <w:lastRenderedPageBreak/>
-        <w:t>µg/m³, sát ngưỡng 115. Các nhánh dưới dùng xu hướng tăng (pm25_delta_1) và trung bình 24 giờ để nhận ra lúc ô nhiễm sắp vượt ngưỡng. Luật đầy đủ nằm trong artifacts/classific</w:t>
-      </w:r>
-      <w:r>
-        <w:t>ation/tree_rules.txt.</w:t>
+        <w:t>Cây quyết định cho thấy PM2.5 hiện tại chiếm 97,4% độ quan trọng; tiếp th</w:t>
+      </w:r>
+      <w:r>
+        <w:t xml:space="preserve">eo là mức thay đổi PM2.5 trong giờ vừa qua (1,5%) và tốc độ gió (0,5%). Nút gốc tách tại PM2.5 ≈ 110 µg/m³, sát ngưỡng 115. Các nhánh bên dưới dùng pm10_ug_m3 (pm10_ug_m3), mức thay đổi PM2.5 trong giờ vừa qua (pm25_delta_1) và tốc độ gió (wind_speed_m_s) </w:t>
+      </w:r>
+      <w:r>
+        <w:t>để tách tiếp những giờ dễ vượt ngưỡng. Luật đầy đủ nằm trong artifacts/classification/tree_rules.txt.</w:t>
       </w:r>
     </w:p>
     <w:p>
@@ -12456,6 +12451,7 @@
         <w:rPr>
           <w:noProof/>
         </w:rPr>
+        <w:lastRenderedPageBreak/>
         <w:drawing>
           <wp:inline distT="0" distB="0" distL="0" distR="0">
             <wp:extent cx="5760000" cy="2880000"/>
@@ -12506,7 +12502,7 @@
       <w:pPr>
         <w:pStyle w:val="Heading2"/>
       </w:pPr>
-      <w:bookmarkStart w:id="36" w:name="_Toc242713037"/>
+      <w:bookmarkStart w:id="36" w:name="_Toc244100484"/>
       <w:r>
         <w:t>6.7. Phân tích bổ trợ</w:t>
       </w:r>
@@ -12525,10 +12521,10 @@
         <w:t xml:space="preserve">Phân cụm trạm (K-Means): </w:t>
       </w:r>
       <w:r>
-        <w:t>12 trạm chia thành 2 cụm (hệ số bóng 0,66, cao nhất trong K ∈ {2, 3, 4}, khớp hoàn toàn với phân cụm phân cấp Ward): "lõi đô thị ô nhi</w:t>
-      </w:r>
-      <w:r>
-        <w:t>ễm" (9 trạm) và "ngoại ô phía bắc sạch hơn" (Changping, Dingling, Huairou). Nhãn cụm được dùng làm đặc trưng.</w:t>
+        <w:t>12 trạm chia thành 2 cụm (hệ số bóng 0,66, cao nhất tr</w:t>
+      </w:r>
+      <w:r>
+        <w:t>ong K ∈ {2, 3, 4}, khớp hoàn toàn với phân cụm phân cấp Ward): "lõi đô thị ô nhiễm" (9 trạm) và "ngoại ô phía bắc sạch hơn" (Changping, Dingling, Huairou). Nhãn cụm được dùng làm đặc trưng.</w:t>
       </w:r>
     </w:p>
     <w:p>
@@ -12544,19 +12540,19 @@
         <w:t xml:space="preserve">Hồi quy PM2.5(t+1): </w:t>
       </w:r>
       <w:r>
-        <w:t>HistGB đạt MAE 8,87 µg/m³ trên test, so với persistence 9,78. Giá trị dự báo hiển thị ở trang /du-bao.</w:t>
+        <w:t>HistGB đạt MAE 8,87 µg/m³ trên test, so với pe</w:t>
+      </w:r>
+      <w:r>
+        <w:t>rsistence 9,78. Giá trị dự báo hiển thị ở trang /du-bao.</w:t>
       </w:r>
     </w:p>
     <w:p>
       <w:pPr>
         <w:pStyle w:val="Heading1"/>
       </w:pPr>
-      <w:bookmarkStart w:id="37" w:name="_Toc242713038"/>
-      <w:r>
-        <w:t>Chương 7. Ứng dụng khai</w:t>
-      </w:r>
-      <w:r>
-        <w:t xml:space="preserve"> phá dữ liệu</w:t>
+      <w:bookmarkStart w:id="37" w:name="_Toc244100485"/>
+      <w:r>
+        <w:t>Chương 7. Ứng dụng khai phá dữ liệu</w:t>
       </w:r>
       <w:bookmarkEnd w:id="37"/>
     </w:p>
@@ -12565,10 +12561,10 @@
         <w:jc w:val="both"/>
       </w:pPr>
       <w:r>
-        <w:t>Kết quả khai phá được đưa vào ứng dụng web chỉ-đọc gồm API FastAPI đọc kho và các mart, cùng giao diện React. Trang Cảnh báo cho người vận hành thấy ma trận nhầm lẫn của mô hình cạnh cách làm hiện tại, dòng thời gian xác suất cảnh báo theo trạ</w:t>
-      </w:r>
-      <w:r>
-        <w:t>m, và các giờ cảnh báo đúng, báo nhầm, bỏ sót.</w:t>
+        <w:t>Kết quả khai phá được đưa vào ứng dụng web chỉ-đọc gồm API FastAPI đọc kho và các mart, cùng giao diện React. Trang Cảnh báo cho người vận hành thấy ma trận nhầm l</w:t>
+      </w:r>
+      <w:r>
+        <w:t>ẫn của mô hình cạnh cách làm hiện tại, và dòng thời gian PM2.5 theo trạm kèm những giờ mô hình đã cảnh báo từ 1 giờ trước, tô màu theo kết quả: cảnh báo đúng, báo nhầm, bỏ sót.</w:t>
       </w:r>
     </w:p>
     <w:p>
@@ -12624,7 +12620,10 @@
         <w:jc w:val="center"/>
       </w:pPr>
       <w:r>
-        <w:t>Hình 7.1. Trang /canh-bao: mô hình so với persistence và dòng thời gian cảnh báo tại Dongsi</w:t>
+        <w:t xml:space="preserve">Hình 7.1. Trang /canh-bao: mô hình so với persistence và dòng thời gian cảnh </w:t>
+      </w:r>
+      <w:r>
+        <w:t>báo tại Dongsi</w:t>
       </w:r>
     </w:p>
     <w:p>
@@ -12797,7 +12796,13 @@
               <w:rPr>
                 <w:sz w:val="21"/>
               </w:rPr>
-              <w:t>Phân loại cảnh báo: ma trận nhầm lẫn, dòng thời gian, so sánh theo trạm</w:t>
+              <w:t xml:space="preserve">Phân loại cảnh báo: ma trận nhầm lẫn, dòng thời gian, so </w:t>
+            </w:r>
+            <w:r>
+              <w:rPr>
+                <w:sz w:val="21"/>
+              </w:rPr>
+              <w:t>sánh theo trạm</w:t>
             </w:r>
           </w:p>
         </w:tc>
@@ -12855,7 +12860,7 @@
               <w:rPr>
                 <w:sz w:val="21"/>
               </w:rPr>
-              <w:t>/tram, /dot-o-nhiem, /thoi-tiet, /ban-do</w:t>
+              <w:t>/phan-cum, /thoi-tiet, /ban-do</w:t>
             </w:r>
           </w:p>
         </w:tc>
@@ -12871,13 +12876,7 @@
               <w:rPr>
                 <w:sz w:val="21"/>
               </w:rPr>
-              <w:t xml:space="preserve">Xếp hạng trạm, đợt ô nhiễm, </w:t>
-            </w:r>
-            <w:r>
-              <w:rPr>
-                <w:sz w:val="21"/>
-              </w:rPr>
-              <w:t>thời tiết, bản đồ 12 trạm</w:t>
+              <w:t>Phân cụm trạm, PM2.5 theo 7 biến thời tiết, bản đồ 12 trạm</w:t>
             </w:r>
           </w:p>
         </w:tc>
@@ -12892,7 +12891,7 @@
       <w:pPr>
         <w:pStyle w:val="Heading1"/>
       </w:pPr>
-      <w:bookmarkStart w:id="38" w:name="_Toc242713039"/>
+      <w:bookmarkStart w:id="38" w:name="_Toc244100486"/>
       <w:r>
         <w:t>Chương 8. Kết luận, khuyến nghị và hạn chế</w:t>
       </w:r>
@@ -12902,7 +12901,7 @@
       <w:pPr>
         <w:pStyle w:val="Heading2"/>
       </w:pPr>
-      <w:bookmarkStart w:id="39" w:name="_Toc242713040"/>
+      <w:bookmarkStart w:id="39" w:name="_Toc244100487"/>
       <w:r>
         <w:t>8.1. Kết quả theo chuẩn đầu ra</w:t>
       </w:r>
@@ -12915,7 +12914,10 @@
         <w:jc w:val="center"/>
       </w:pPr>
       <w:r>
-        <w:t>Bảng 8.1. Đối chiếu với chuẩn đầu ra</w:t>
+        <w:t xml:space="preserve">Bảng 8.1. Đối chiếu với </w:t>
+      </w:r>
+      <w:r>
+        <w:t>chuẩn đầu ra</w:t>
       </w:r>
     </w:p>
     <w:tbl>
@@ -13062,7 +13064,13 @@
               <w:rPr>
                 <w:sz w:val="21"/>
               </w:rPr>
-              <w:t>CLO2.TC1 Giải bài toán khai phá</w:t>
+              <w:t>CLO2.TC1 Giải bài to</w:t>
+            </w:r>
+            <w:r>
+              <w:rPr>
+                <w:sz w:val="21"/>
+              </w:rPr>
+              <w:t>án khai phá</w:t>
             </w:r>
           </w:p>
         </w:tc>
@@ -13136,7 +13144,6 @@
               <w:rPr>
                 <w:sz w:val="21"/>
               </w:rPr>
-              <w:lastRenderedPageBreak/>
               <w:t>CLO3 Làm việc nhóm</w:t>
             </w:r>
           </w:p>
@@ -13153,7 +13160,13 @@
               <w:rPr>
                 <w:sz w:val="21"/>
               </w:rPr>
-              <w:t>Bảng phân công (Phụ lục B), lịch sử Git, biên bản họp</w:t>
+              <w:t xml:space="preserve">Bảng phân công (Phụ lục B), lịch sử Git, biên bản </w:t>
+            </w:r>
+            <w:r>
+              <w:rPr>
+                <w:sz w:val="21"/>
+              </w:rPr>
+              <w:t>họp</w:t>
             </w:r>
           </w:p>
         </w:tc>
@@ -13168,7 +13181,7 @@
       <w:pPr>
         <w:pStyle w:val="Heading2"/>
       </w:pPr>
-      <w:bookmarkStart w:id="40" w:name="_Toc242713041"/>
+      <w:bookmarkStart w:id="40" w:name="_Toc244100488"/>
       <w:r>
         <w:t>8.2. Khuyến nghị hành động</w:t>
       </w:r>
@@ -13181,10 +13194,7 @@
         <w:jc w:val="both"/>
       </w:pPr>
       <w:r>
-        <w:t xml:space="preserve">Dùng xác suất của mô hình để phát cảnh báo giờ tới thay vì chờ số đo vượt ngưỡng. Mô hình báo </w:t>
-      </w:r>
-      <w:r>
-        <w:t>trước được khoảng 30% số lần ô nhiễm bắt đầu, những lúc mà cách làm hiện tại luôn bỏ lỡ.</w:t>
+        <w:t>Dùng xác suất của mô hình để phát cảnh báo giờ tới thay vì chờ số đo vượt ngưỡng. Mô hình báo trước được khoảng 30% số lần ô nhiễm bắt đầu, những lúc mà cách làm hiện tại luôn bỏ lỡ.</w:t>
       </w:r>
     </w:p>
     <w:p>
@@ -13194,7 +13204,10 @@
         <w:jc w:val="both"/>
       </w:pPr>
       <w:r>
-        <w:t>Tập trung nguồn lực giám sát vào mùa đông, buổi tối và đêm, đặc biệt khi có gió nam: trong các điều kiện này PM2.5 trung bình và tỷ lệ giờ vượt ngưỡng cao hơn rõ rệt.</w:t>
+        <w:t>Tập trung nguồn lực giám sát vào mùa đôn</w:t>
+      </w:r>
+      <w:r>
+        <w:t>g, buổi tối và đêm, đặc biệt khi có gió nam: trong các điều kiện này PM2.5 trung bình và tỷ lệ giờ vượt ngưỡng cao hơn rõ rệt.</w:t>
       </w:r>
     </w:p>
     <w:p>
@@ -13211,7 +13224,7 @@
       <w:pPr>
         <w:pStyle w:val="Heading2"/>
       </w:pPr>
-      <w:bookmarkStart w:id="41" w:name="_Toc242713042"/>
+      <w:bookmarkStart w:id="41" w:name="_Toc244100489"/>
       <w:r>
         <w:t>8.3. Hạn chế</w:t>
       </w:r>
@@ -13224,7 +13237,10 @@
         <w:jc w:val="both"/>
       </w:pPr>
       <w:r>
-        <w:t>Tập test chỉ là 6 tháng cuối 2016; dữ liệu là lịch sử 2013–2017, chưa kiểm chứng trên dữ liệu thời gian thực.</w:t>
+        <w:t>Tậ</w:t>
+      </w:r>
+      <w:r>
+        <w:t>p test chỉ là 6 tháng cuối 2016; dữ liệu là lịch sử 2013–2017, chưa kiểm chứng trên dữ liệu thời gian thực.</w:t>
       </w:r>
     </w:p>
     <w:p>
@@ -13234,10 +13250,7 @@
         <w:jc w:val="both"/>
       </w:pPr>
       <w:r>
-        <w:t xml:space="preserve">Tầm cảnh báo chính </w:t>
-      </w:r>
-      <w:r>
-        <w:t>là 1 giờ, khá ngắn cho các quyết định lớn. Ở tầm dài hơn, độ chính xác giảm.</w:t>
+        <w:t>Tầm cảnh báo chính là 1 giờ, khá ngắn cho các quyết định lớn. Ở tầm dài hơn, độ chính xác giảm.</w:t>
       </w:r>
     </w:p>
     <w:p>
@@ -13247,7 +13260,10 @@
         <w:jc w:val="both"/>
       </w:pPr>
       <w:r>
-        <w:t>Ngưỡng 115 µg/m³ vốn là ngưỡng trung bình 24 giờ của chuẩn AQI, ở đây được áp cho từng giờ để làm tín hiệu cảnh báo.</w:t>
+        <w:t>Ngưỡng 115 µg/m³ vốn là ngưỡng trung bình 24 giờ của</w:t>
+      </w:r>
+      <w:r>
+        <w:t xml:space="preserve"> chuẩn AQI, ở đây được áp cho từng giờ để làm tín hiệu cảnh báo.</w:t>
       </w:r>
     </w:p>
     <w:p>
@@ -13257,10 +13273,7 @@
         <w:jc w:val="both"/>
       </w:pPr>
       <w:r>
-        <w:t>Mô hình phụ thuộc mạnh vào giá trị PM2.5 hiện tại, nên phần cả</w:t>
-      </w:r>
-      <w:r>
-        <w:t>i thiện so với persistence là khiêm tốn (F1 tăng 0,013 ở tầm 1 giờ) dù đã được kiểm định là có ý nghĩa.</w:t>
+        <w:t>Mô hình phụ thuộc mạnh vào giá trị PM2.5 hiện tại, nên phần cải thiện so với persistence là khiêm tốn (F1 tăng 0,013 ở tầm 1 giờ) dù đã được kiểm định là có ý nghĩa.</w:t>
       </w:r>
     </w:p>
     <w:p>
@@ -13270,14 +13283,17 @@
         <w:jc w:val="both"/>
       </w:pPr>
       <w:r>
-        <w:t>Thời tiết lấp từ dữ liệu tái phân tích ERA5 có độ phân giải không gian thô hơn trạm đo.</w:t>
+        <w:t xml:space="preserve">Thời tiết lấp từ dữ liệu </w:t>
+      </w:r>
+      <w:r>
+        <w:t>tái phân tích ERA5 có độ phân giải không gian thô hơn trạm đo.</w:t>
       </w:r>
     </w:p>
     <w:p>
       <w:pPr>
         <w:pStyle w:val="Heading2"/>
       </w:pPr>
-      <w:bookmarkStart w:id="42" w:name="_Toc242713043"/>
+      <w:bookmarkStart w:id="42" w:name="_Toc244100490"/>
       <w:r>
         <w:t>8.4. Hướng phát triển</w:t>
       </w:r>
@@ -13290,10 +13306,7 @@
         <w:jc w:val="both"/>
       </w:pPr>
       <w:r>
-        <w:t>Đưa dự báo thời tiết (gió, độ ẩm của giờ t</w:t>
-      </w:r>
-      <w:r>
-        <w:t>ới) vào làm đặc trưng để cảnh báo sớm hơn.</w:t>
+        <w:t>Đưa dự báo thời tiết (gió, độ ẩm của giờ tới) vào làm đặc trưng để cảnh báo sớm hơn.</w:t>
       </w:r>
     </w:p>
     <w:p>
@@ -13303,7 +13316,10 @@
         <w:jc w:val="both"/>
       </w:pPr>
       <w:r>
-        <w:t>Thêm chiều Chất ô nhiễm (bảng sự kiện dạng dài) để OLAP so sánh các chất trong cùng một khối.</w:t>
+        <w:t>Thêm chiều Chất ô nhiễm (bảng sự kiện dạng dài) để OLAP so sánh các chất trong cùng mộ</w:t>
+      </w:r>
+      <w:r>
+        <w:t>t khối.</w:t>
       </w:r>
     </w:p>
     <w:p>
@@ -13325,7 +13341,7 @@
       <w:pPr>
         <w:pStyle w:val="Heading1"/>
       </w:pPr>
-      <w:bookmarkStart w:id="43" w:name="_Toc242713044"/>
+      <w:bookmarkStart w:id="43" w:name="_Toc244100491"/>
       <w:r>
         <w:lastRenderedPageBreak/>
         <w:t>Phụ lục A. Hướng dẫn chạy lại từ đầu</w:t>
@@ -13343,14 +13359,7 @@
           <w:rFonts w:ascii="Consolas" w:hAnsi="Consolas"/>
           <w:sz w:val="19"/>
         </w:rPr>
-        <w:t xml:space="preserve">git clone &lt;repo&gt; &amp;&amp; </w:t>
-      </w:r>
-      <w:r>
-        <w:rPr>
-          <w:rFonts w:ascii="Consolas" w:hAnsi="Consolas"/>
-          <w:sz w:val="19"/>
-        </w:rPr>
-        <w:t>cd air-quality-analytics-platform</w:t>
+        <w:t>git clone &lt;repo&gt; &amp;&amp; cd air-quality-analytics-platform</w:t>
       </w:r>
     </w:p>
     <w:p>
@@ -13420,14 +13429,7 @@
           <w:rFonts w:ascii="Consolas" w:hAnsi="Consolas"/>
           <w:sz w:val="19"/>
         </w:rPr>
-        <w:t xml:space="preserve">cd </w:t>
-      </w:r>
-      <w:r>
-        <w:rPr>
-          <w:rFonts w:ascii="Consolas" w:hAnsi="Consolas"/>
-          <w:sz w:val="19"/>
-        </w:rPr>
-        <w:t>dashboard/web &amp;&amp; npm install &amp;&amp; npm run dev   # giao diện: http://localhost:5180</w:t>
+        <w:t>cd dashboard/web &amp;&amp; npm install &amp;&amp; npm run dev   # giao diện: http://localhost:5180</w:t>
       </w:r>
     </w:p>
     <w:p>
@@ -13440,17 +13442,17 @@
         <w:jc w:val="both"/>
       </w:pPr>
       <w:r>
-        <w:t>Yêu cầu: Docker Desktop đang chạy, Python ≥ 3.10, có Internet ở lần chạy đầu. Nếu cổng bị trùng, sửa POSTGRES_PORT, MINIO_PORT, MINIO_ENDPOINT, MINIO_CONSOLE_PORT, DASHBOARD_</w:t>
-      </w:r>
-      <w:r>
-        <w:t>API_PORT trong .env. Tuỳ chọn: --list, --from BƯỚC, --only, --skip, --retrain-all, --with-airflow.</w:t>
+        <w:t xml:space="preserve">Yêu cầu: Docker Desktop đang chạy, Python ≥ 3.10, có </w:t>
+      </w:r>
+      <w:r>
+        <w:t>Internet ở lần chạy đầu. Nếu cổng bị trùng, sửa POSTGRES_PORT, MINIO_PORT, MINIO_ENDPOINT, MINIO_CONSOLE_PORT, DASHBOARD_API_PORT trong .env. Tuỳ chọn: --list, --from BƯỚC, --only, --skip, --retrain-all, --with-airflow.</w:t>
       </w:r>
     </w:p>
     <w:p>
       <w:pPr>
         <w:pStyle w:val="Heading1"/>
       </w:pPr>
-      <w:bookmarkStart w:id="44" w:name="_Toc242713045"/>
+      <w:bookmarkStart w:id="44" w:name="_Toc244100492"/>
       <w:r>
         <w:t>Phụ lục B. Bảng phân công</w:t>
       </w:r>
@@ -13464,13 +13466,13 @@
         <w:rPr>
           <w:i/>
         </w:rPr>
-        <w:t>NHÓM ĐIỀN — mỗi thành viên phải trình bày được phần của mình. Bằng chứng: lịch sử Git và biên bản họp (bao_cao/BANG_PHAN_CONG.md, b</w:t>
+        <w:t xml:space="preserve">NHÓM ĐIỀN </w:t>
       </w:r>
       <w:r>
         <w:rPr>
           <w:i/>
         </w:rPr>
-        <w:t>ao_cao/BIEN_BAN_HOP_TEMPLATE.md).</w:t>
+        <w:t>— mỗi thành viên phải trình bày được phần của mình. Bằng chứng: lịch sử Git và biên bản họp (bao_cao/BANG_PHAN_CONG.md, bao_cao/BIEN_BAN_HOP_TEMPLATE.md).</w:t>
       </w:r>
     </w:p>
     <w:p>
@@ -13610,7 +13612,13 @@
               <w:rPr>
                 <w:sz w:val="20"/>
               </w:rPr>
-              <w:t>1. Thu thập &amp; tiền xử lý</w:t>
+              <w:t xml:space="preserve">1. </w:t>
+            </w:r>
+            <w:r>
+              <w:rPr>
+                <w:sz w:val="20"/>
+              </w:rPr>
+              <w:t>Thu thập &amp; tiền xử lý</w:t>
             </w:r>
           </w:p>
         </w:tc>
@@ -14199,9 +14207,12 @@
       <w:pPr>
         <w:pStyle w:val="Heading1"/>
       </w:pPr>
-      <w:bookmarkStart w:id="45" w:name="_Toc242713046"/>
-      <w:r>
-        <w:t>Phụ lục C. Khai báo sử dụng công cụ AI</w:t>
+      <w:bookmarkStart w:id="45" w:name="_Toc244100493"/>
+      <w:r>
+        <w:t xml:space="preserve">Phụ lục C. Khai báo sử </w:t>
+      </w:r>
+      <w:r>
+        <w:t>dụng công cụ AI</w:t>
       </w:r>
       <w:bookmarkEnd w:id="45"/>
     </w:p>
@@ -14210,10 +14221,7 @@
         <w:jc w:val="both"/>
       </w:pPr>
       <w:r>
-        <w:t xml:space="preserve">Theo yêu cầu của học phần, nhóm khai báo các công cụ AI đã sử dụng. Nội dung chi tiết (cần nhóm rà </w:t>
-      </w:r>
-      <w:r>
-        <w:t>soát, bổ sung và ký xác nhận) nằm ở bao_cao/KHAI_BAO_AI.md. Tóm tắt:</w:t>
+        <w:t>Theo yêu cầu của học phần, nhóm khai báo các công cụ AI đã sử dụng. Nội dung chi tiết (cần nhóm rà soát, bổ sung và ký xác nhận) nằm ở bao_cao/KHAI_BAO_AI.md. Tóm tắt:</w:t>
       </w:r>
     </w:p>
     <w:p>
@@ -14223,10 +14231,10 @@
         <w:jc w:val="both"/>
       </w:pPr>
       <w:r>
-        <w:t>Claude Code (Anthropic, mô hình Claude Opus 5.5), phiên ngày 12/10/2026: đánh giá repo so với yêu cầu Bài 12; viết module phân loại cảnh báo, chiều hướng gió, khối CUBE, các truy vấn và t</w:t>
-      </w:r>
-      <w:r>
-        <w:t>rang OLAP, trang cảnh báo, script chạy một lệnh, tài liệu thiết kế; soạn bản nháp báo cáo và slide này.</w:t>
+        <w:t>Claude Code (Anthropic, mô hình Claude Opus 5.5), phiên ngày 12/10/2026:</w:t>
+      </w:r>
+      <w:r>
+        <w:t xml:space="preserve"> đánh giá repo so với yêu cầu Bài 12; viết module phân loại cảnh báo, chiều hướng gió, khối CUBE, các truy vấn và trang OLAP, trang cảnh báo, script chạy một lệnh, tài liệu thiết kế; soạn bản nháp báo cáo và slide này.</w:t>
       </w:r>
     </w:p>
     <w:p>
@@ -14236,10 +14244,10 @@
         <w:jc w:val="both"/>
       </w:pPr>
       <w:r>
-        <w:t>[NHÓM ĐIỀN] Các công cụ AI khác đã dùng trong các phase trước (tài liệu docs/PROJECT_CONTEXT.md nhắc tới các phiên ChatGPT): công cụ, mục đích, phần việ</w:t>
-      </w:r>
-      <w:r>
-        <w:t>c liên quan.</w:t>
+        <w:t>Claude Code, phiên ngày 28/10/2026: t</w:t>
+      </w:r>
+      <w:r>
+        <w:t>hêm bộ nhớ đệm cho API và giao diện; thiết kế lại giao diện dashboard; chạy thử nghiệm bỏ biến thời tiết theo từng tầm dự báo; cập nhật báo cáo, slide và ảnh dashboard.</w:t>
       </w:r>
     </w:p>
     <w:p>
@@ -14250,14 +14258,30 @@
       </w:pPr>
       <w:r>
         <w:lastRenderedPageBreak/>
-        <w:t>Mọi số liệu trong báo cáo đều được sinh từ mã nguồn chạy trên dữ liệu thật (artifacts/), không do AI tự viết ra. Nhóm chịu trách nhiệm kiểm tra và giải thích được toàn bộ nội dung.</w:t>
+        <w:t>[NHÓM ĐIỀN] Các công cụ AI khác đã dùng trong các phase trước (tài liệu docs/PROJECT_CO</w:t>
+      </w:r>
+      <w:r>
+        <w:t>NTEXT.md nhắc tới các phiên ChatGPT): công cụ, mục đích, phần việc liên quan.</w:t>
       </w:r>
     </w:p>
     <w:p>
       <w:pPr>
+        <w:pStyle w:val="ListBullet"/>
+        <w:spacing w:after="40"/>
+        <w:jc w:val="both"/>
+      </w:pPr>
+      <w:r>
+        <w:t>Mọi số liệu trong báo cáo đều được sinh từ mã nguồn chạy trên dữ liệu thật (artifacts/), không do AI tự viết ra. Nhóm chịu trách nhiệm kiểm tra và giải thích được toàn bộ nội dun</w:t>
+      </w:r>
+      <w:r>
+        <w:t>g.</w:t>
+      </w:r>
+    </w:p>
+    <w:p>
+      <w:pPr>
         <w:pStyle w:val="Heading1"/>
       </w:pPr>
-      <w:bookmarkStart w:id="46" w:name="_Toc242713047"/>
+      <w:bookmarkStart w:id="46" w:name="_Toc244100494"/>
       <w:r>
         <w:t>Tài liệu tham khảo</w:t>
       </w:r>
@@ -14270,10 +14294,7 @@
         <w:jc w:val="both"/>
       </w:pPr>
       <w:r>
-        <w:t>Nguyễn Quỳnh Chi (2018). Bài giảng Kho dữ l</w:t>
-      </w:r>
-      <w:r>
-        <w:t>iệu và Kỹ thuật khai phá. Học viện Công nghệ Bưu chính Viễn thông.</w:t>
+        <w:t>Nguyễn Quỳnh Chi (2018). Bài giảng Kho dữ liệu và Kỹ thuật khai phá. Học viện Công nghệ Bưu chính Viễn thông.</w:t>
       </w:r>
     </w:p>
     <w:p>
@@ -14293,7 +14314,10 @@
         <w:jc w:val="both"/>
       </w:pPr>
       <w:r>
-        <w:t>Aggarwal, C. C. (2015). Data Mining: The Textbook. Springer.</w:t>
+        <w:t>Aggarwal, C. C. (201</w:t>
+      </w:r>
+      <w:r>
+        <w:t>5). Data Mining: The Textbook. Springer.</w:t>
       </w:r>
     </w:p>
     <w:p>
@@ -14303,10 +14327,7 @@
         <w:jc w:val="both"/>
       </w:pPr>
       <w:r>
-        <w:t>Bramer, M. (2016). Princ</w:t>
-      </w:r>
-      <w:r>
-        <w:t>iples of Data Mining (3rd ed.). Springer.</w:t>
+        <w:t>Bramer, M. (2016). Principles of Data Mining (3rd ed.). Springer.</w:t>
       </w:r>
     </w:p>
     <w:p>
@@ -14326,7 +14347,10 @@
         <w:jc w:val="both"/>
       </w:pPr>
       <w:r>
-        <w:t>Reis, J., &amp; Housley, M. (2022). Fundamentals of Data Engineering. O'Reilly.</w:t>
+        <w:t xml:space="preserve">Reis, J., &amp; Housley, M. (2022). Fundamentals of Data Engineering. </w:t>
+      </w:r>
+      <w:r>
+        <w:t>O'Reilly.</w:t>
       </w:r>
     </w:p>
     <w:p>
@@ -14336,10 +14360,7 @@
         <w:jc w:val="both"/>
       </w:pPr>
       <w:r>
-        <w:t xml:space="preserve">Chen, S. (2017). Beijing Multi-Site Air Quality [Dataset]. </w:t>
-      </w:r>
-      <w:r>
-        <w:t>UCI Machine Learning Repository. https://doi.org/10.24432/C5RK5G</w:t>
+        <w:t>Chen, S. (2017). Beijing Multi-Site Air Quality [Dataset]. UCI Machine Learning Repository. https://doi.org/10.24432/C5RK5G</w:t>
       </w:r>
     </w:p>
     <w:p>
@@ -14349,7 +14370,10 @@
         <w:jc w:val="both"/>
       </w:pPr>
       <w:r>
-        <w:t>Zhang, S., Guo, B., Dong, A., He, J., Xu, Z., &amp; Chen, S. X. (2017). Cautionary tales on air-quality improvement in Beijing. Proceedings of the Royal Society A, 473(2205).</w:t>
+        <w:t>Zhang, S., Guo, B., Dong, A., He, J., Xu, Z., &amp; Chen, S. X. (2017). Cautionary tales on air-quality improvement in Beijing</w:t>
+      </w:r>
+      <w:r>
+        <w:t>. Proceedings of the Royal Society A, 473(2205).</w:t>
       </w:r>
     </w:p>
     <w:p>
@@ -14359,10 +14383,7 @@
         <w:jc w:val="both"/>
       </w:pPr>
       <w:r>
-        <w:t>Open-Meteo. Historic</w:t>
-      </w:r>
-      <w:r>
-        <w:t>al Weather API. https://open-meteo.com/en/docs/historical-weather-api</w:t>
+        <w:t>Open-Meteo. Historical Weather API. https://open-meteo.com/en/docs/historical-weather-api</w:t>
       </w:r>
     </w:p>
     <w:p>
@@ -14382,10 +14403,10 @@
         <w:jc w:val="both"/>
       </w:pPr>
       <w:r>
-        <w:t>Bộ Bảo vệ Môi trường Trung Quốc (2012). HJ 633-2012 — Technical Regulation on Ambient Air Qual</w:t>
-      </w:r>
-      <w:r>
-        <w:t>ity Index.</w:t>
+        <w:t>Bộ Bảo vệ Môi trường Trun</w:t>
+      </w:r>
+      <w:r>
+        <w:t>g Quốc (2012). HJ 633-2012 — Technical Regulation on Ambient Air Quality Index.</w:t>
       </w:r>
     </w:p>
     <w:sectPr>
@@ -26069,7 +26090,7 @@
     <w:autoRedefine/>
     <w:uiPriority w:val="39"/>
     <w:unhideWhenUsed/>
-    <w:rsid w:val="00980B26"/>
+    <w:rsid w:val="0078116D"/>
     <w:pPr>
       <w:spacing w:after="100"/>
     </w:pPr>
@@ -26081,7 +26102,7 @@
     <w:autoRedefine/>
     <w:uiPriority w:val="39"/>
     <w:unhideWhenUsed/>
-    <w:rsid w:val="00980B26"/>
+    <w:rsid w:val="0078116D"/>
     <w:pPr>
       <w:spacing w:after="100"/>
       <w:ind w:left="260"/>
@@ -26092,7 +26113,7 @@
     <w:basedOn w:val="DefaultParagraphFont"/>
     <w:uiPriority w:val="99"/>
     <w:unhideWhenUsed/>
-    <w:rsid w:val="00980B26"/>
+    <w:rsid w:val="0078116D"/>
     <w:rPr>
       <w:color w:val="0000FF" w:themeColor="hyperlink"/>
       <w:u w:val="single"/>
@@ -26426,7 +26447,7 @@
 </file>
 
 <file path=customXml/itemProps1.xml><?xml version="1.0" encoding="utf-8"?>
-<ds:datastoreItem xmlns:ds="http://schemas.openxmlformats.org/officeDocument/2006/customXml" ds:itemID="{C770E10E-C6B4-43A6-B721-25A180130E11}">
+<ds:datastoreItem xmlns:ds="http://schemas.openxmlformats.org/officeDocument/2006/customXml" ds:itemID="{885CCFD5-870B-4BC8-AED7-0950C5616F6E}">
   <ds:schemaRefs>
     <ds:schemaRef ds:uri="http://schemas.openxmlformats.org/officeDocument/2006/bibliography"/>
   </ds:schemaRefs>

</xml_diff>